<commit_message>
Atualiza toda a documentação externa para a UX publicada em 05/10/2026.
Alinha fontes, pacotes 1–7, PDFs/DOCX, manuais e checklists a Início+menu+engrenagem, multi-tenant, recepção/régua, Ghost, billing e demais implementações recentes.

Co-authored-by: Cursor <cursoragent@cursor.com>
</commit_message>
<xml_diff>
--- a/docs/Experiencia-do-Usuario-Conecta.docx
+++ b/docs/Experiencia-do-Usuario-Conecta.docx
@@ -36,7 +36,7 @@
     </w:p>
     <w:p>
       <w:pPr>
-        <w:spacing w:after="360"/>
+        <w:spacing w:after="80"/>
         <w:jc w:val="center"/>
       </w:pPr>
       <w:r>
@@ -53,6 +53,21 @@
     </w:p>
     <w:p>
       <w:pPr>
+        <w:spacing w:after="360"/>
+        <w:jc w:val="center"/>
+      </w:pPr>
+      <w:r>
+        <w:rPr>
+          <w:rFonts w:ascii="Calibri" w:cs="Calibri" w:eastAsia="Calibri" w:hAnsi="Calibri"/>
+          <w:color w:val="475569"/>
+          <w:sz w:val="20"/>
+          <w:szCs w:val="20"/>
+        </w:rPr>
+        <w:t xml:space="preserve">Atualizado em 05/10/2026</w:t>
+      </w:r>
+    </w:p>
+    <w:p>
+      <w:pPr>
         <w:pStyle w:val="Heading1"/>
         <w:spacing w:after="160" w:before="360"/>
       </w:pPr>
@@ -220,7 +235,7 @@
           <w:sz w:val="22"/>
           <w:szCs w:val="22"/>
         </w:rPr>
-        <w:t xml:space="preserve">Abre deslizando sobre a tela. Lista atalhos da vida comunitária: Início, Perfil, Financeiro, Minha Célula, Escalas, murais, Sugestões, Como faço…?, Redes Sociais e Sobre o Conecta+.</w:t>
+        <w:t xml:space="preserve">Abre deslizando sobre a tela. Lista atalhos da vida comunitária: Início, Perfil, Financeiro, Documentos oficiais, Minha Célula, Escalas, murais, Apoio Mútuo, Sugestões, Como faço…?, Redes Sociais e Sobre o Conecta+.</w:t>
       </w:r>
     </w:p>
     <w:p>
@@ -385,7 +400,7 @@
           <w:sz w:val="22"/>
           <w:szCs w:val="22"/>
         </w:rPr>
-        <w:t xml:space="preserve">Em listas longas, a busca pode abrir um painel no topo da tela. A pessoa digita e vê o recorte imediatamente, em vez de varrer a página inteira.</w:t>
+        <w:t xml:space="preserve">Em listas longas, o padrão Enxergar abre a busca e os resultados filtrados em um modal no topo da tela. A pessoa mantém o mesmo critério de pesquisa daquela lista e vê o recorte imediatamente, em vez de varrer a página inteira.</w:t>
       </w:r>
     </w:p>
     <w:p>
@@ -674,6 +689,25 @@
     </w:p>
     <w:p>
       <w:pPr>
+        <w:pStyle w:val="ListParagraph"/>
+        <w:numPr>
+          <w:ilvl w:val="0"/>
+          <w:numId w:val="2"/>
+        </w:numPr>
+        <w:spacing w:after="80" w:line="276"/>
+      </w:pPr>
+      <w:r>
+        <w:rPr>
+          <w:rFonts w:ascii="Calibri" w:cs="Calibri" w:eastAsia="Calibri" w:hAnsi="Calibri"/>
+          <w:color w:val="334155"/>
+          <w:sz w:val="22"/>
+          <w:szCs w:val="22"/>
+        </w:rPr>
+        <w:t xml:space="preserve">O mesmo telefone pode existir em igrejas diferentes. No totem, telefone e PIN são validados dentro da instância ativa, sem misturar cadastros de outros tenants.</w:t>
+      </w:r>
+    </w:p>
+    <w:p>
+      <w:pPr>
         <w:pStyle w:val="Heading1"/>
         <w:spacing w:after="160" w:before="360"/>
       </w:pPr>
@@ -762,6 +796,51 @@
           <w:sz w:val="26"/>
           <w:szCs w:val="26"/>
         </w:rPr>
+        <w:t xml:space="preserve">Admissão e celebrações do dia</w:t>
+      </w:r>
+    </w:p>
+    <w:p>
+      <w:pPr>
+        <w:spacing w:after="160" w:line="276"/>
+      </w:pPr>
+      <w:r>
+        <w:rPr>
+          <w:rFonts w:ascii="Calibri" w:cs="Calibri" w:eastAsia="Calibri" w:hAnsi="Calibri"/>
+          <w:color w:val="334155"/>
+          <w:sz w:val="22"/>
+          <w:szCs w:val="22"/>
+        </w:rPr>
+        <w:t xml:space="preserve">Uma etiqueta amarela retrátil de admissão fica sempre disponível para o Super Administrador. Para Secretaria e Equipe Pastoral, aparece quando há pendência. Se houver cadastro na Recepção Familiar, abre esse painel; caso contrário, abre Mudança de Papéis já filtrada em Visitante. Sem pendências, o Super Administrador vê a confirmação de que não há novos registros aguardando admissão.</w:t>
+      </w:r>
+    </w:p>
+    <w:p>
+      <w:pPr>
+        <w:spacing w:after="160" w:line="276"/>
+      </w:pPr>
+      <w:r>
+        <w:rPr>
+          <w:rFonts w:ascii="Calibri" w:cs="Calibri" w:eastAsia="Calibri" w:hAnsi="Calibri"/>
+          <w:color w:val="334155"/>
+          <w:sz w:val="22"/>
+          <w:szCs w:val="22"/>
+        </w:rPr>
+        <w:t xml:space="preserve">O bolo de celebração só aparece quando há aniversário pessoal ou aniversário de casamento naquele dia. A lista mostra as celebrações de hoje; para Secretaria e Super Administrador, oferece também a cópia da mensagem pronta de felicitação.</w:t>
+      </w:r>
+    </w:p>
+    <w:p>
+      <w:pPr>
+        <w:pStyle w:val="Heading2"/>
+        <w:spacing w:after="120" w:before="280"/>
+      </w:pPr>
+      <w:r>
+        <w:rPr>
+          <w:rFonts w:ascii="Calibri" w:cs="Calibri" w:eastAsia="Calibri" w:hAnsi="Calibri"/>
+          <w:b/>
+          <w:bCs/>
+          <w:color w:val="1B4F8A"/>
+          <w:sz w:val="26"/>
+          <w:szCs w:val="26"/>
+        </w:rPr>
         <w:t xml:space="preserve">Eu quero…</w:t>
       </w:r>
     </w:p>
@@ -776,7 +855,7 @@
           <w:sz w:val="22"/>
           <w:szCs w:val="22"/>
         </w:rPr>
-        <w:t xml:space="preserve">No rodapé da home, a pessoa escolhe uma intenção. Contribuir abre um submenu: Dízimos e Ofertas (informa o valor e copia o Pix), Campanhas e Projetos (Pix já identificado na campanha) e Prímicias (compromisso com um item em espécie). Ao lado, Fazer um pedido de oração abre o cuidado pastoral. Na mesma linha do título há o atalho da assistente em conversa (Abigail), em janela sobre a home, para perguntas em linguagem natural.</w:t>
+        <w:t xml:space="preserve">No rodapé da home, a pessoa escolhe uma intenção. Contribuir abre um submenu: Dízimos e Ofertas (informa o valor e copia o Pix), Campanhas e Projetos (Pix já identificado na campanha) e Prímicias (compromisso com um item em espécie). Cuidado Pastoral é o caminho publicado para pedido de oração, intercessão, conversa ou acompanhamento. Na mesma linha do título Eu quero… fica o atalho da assistente Abigail, em janela sobre a home, para perguntas em linguagem natural.</w:t>
       </w:r>
     </w:p>
     <w:p>
@@ -1072,21 +1151,21 @@
           <w:sz w:val="24"/>
           <w:szCs w:val="24"/>
         </w:rPr>
-        <w:t xml:space="preserve">Sugestões</w:t>
-      </w:r>
-    </w:p>
-    <w:p>
-      <w:pPr>
-        <w:spacing w:after="160" w:line="276"/>
-      </w:pPr>
-      <w:r>
-        <w:rPr>
-          <w:rFonts w:ascii="Calibri" w:cs="Calibri" w:eastAsia="Calibri" w:hAnsi="Calibri"/>
-          <w:color w:val="334155"/>
-          <w:sz w:val="22"/>
-          <w:szCs w:val="22"/>
-        </w:rPr>
-        <w:t xml:space="preserve">Canal para enviar ideias e melhorias, e acompanhar o que já foi registrado.</w:t>
+        <w:t xml:space="preserve">Apoio Mútuo</w:t>
+      </w:r>
+    </w:p>
+    <w:p>
+      <w:pPr>
+        <w:spacing w:after="160" w:line="276"/>
+      </w:pPr>
+      <w:r>
+        <w:rPr>
+          <w:rFonts w:ascii="Calibri" w:cs="Calibri" w:eastAsia="Calibri" w:hAnsi="Calibri"/>
+          <w:color w:val="334155"/>
+          <w:sz w:val="22"/>
+          <w:szCs w:val="22"/>
+        </w:rPr>
+        <w:t xml:space="preserve">A pessoa escolhe primeiro uma categoria de serviço, vê os nomes da comunidade que oferecem aquele trabalho e toca em um nome para abrir o cartão completo, com apresentação e meios de contato.</w:t>
       </w:r>
     </w:p>
     <w:p>
@@ -1103,21 +1182,21 @@
           <w:sz w:val="24"/>
           <w:szCs w:val="24"/>
         </w:rPr>
-        <w:t xml:space="preserve">Como faço…?</w:t>
-      </w:r>
-    </w:p>
-    <w:p>
-      <w:pPr>
-        <w:spacing w:after="160" w:line="276"/>
-      </w:pPr>
-      <w:r>
-        <w:rPr>
-          <w:rFonts w:ascii="Calibri" w:cs="Calibri" w:eastAsia="Calibri" w:hAnsi="Calibri"/>
-          <w:color w:val="334155"/>
-          <w:sz w:val="22"/>
-          <w:szCs w:val="22"/>
-        </w:rPr>
-        <w:t xml:space="preserve">Catálogo pesquisável de artigos de ajuda. O toque abre o texto em modal. Há um catálogo voltado à vida da pessoa e outro voltado às telas da engrenagem.</w:t>
+        <w:t xml:space="preserve">Sugestões</w:t>
+      </w:r>
+    </w:p>
+    <w:p>
+      <w:pPr>
+        <w:spacing w:after="160" w:line="276"/>
+      </w:pPr>
+      <w:r>
+        <w:rPr>
+          <w:rFonts w:ascii="Calibri" w:cs="Calibri" w:eastAsia="Calibri" w:hAnsi="Calibri"/>
+          <w:color w:val="334155"/>
+          <w:sz w:val="22"/>
+          <w:szCs w:val="22"/>
+        </w:rPr>
+        <w:t xml:space="preserve">Canal para enviar ideias e melhorias, e acompanhar o que já foi registrado.</w:t>
       </w:r>
     </w:p>
     <w:p>
@@ -1134,21 +1213,21 @@
           <w:sz w:val="24"/>
           <w:szCs w:val="24"/>
         </w:rPr>
-        <w:t xml:space="preserve">Redes sociais e Sobre o Conecta+</w:t>
-      </w:r>
-    </w:p>
-    <w:p>
-      <w:pPr>
-        <w:spacing w:after="160" w:line="276"/>
-      </w:pPr>
-      <w:r>
-        <w:rPr>
-          <w:rFonts w:ascii="Calibri" w:cs="Calibri" w:eastAsia="Calibri" w:hAnsi="Calibri"/>
-          <w:color w:val="334155"/>
-          <w:sz w:val="22"/>
-          <w:szCs w:val="22"/>
-        </w:rPr>
-        <w:t xml:space="preserve">Links e presença da igreja nas redes, e uma tela institucional sobre o produto.</w:t>
+        <w:t xml:space="preserve">Como faço…?</w:t>
+      </w:r>
+    </w:p>
+    <w:p>
+      <w:pPr>
+        <w:spacing w:after="160" w:line="276"/>
+      </w:pPr>
+      <w:r>
+        <w:rPr>
+          <w:rFonts w:ascii="Calibri" w:cs="Calibri" w:eastAsia="Calibri" w:hAnsi="Calibri"/>
+          <w:color w:val="334155"/>
+          <w:sz w:val="22"/>
+          <w:szCs w:val="22"/>
+        </w:rPr>
+        <w:t xml:space="preserve">Catálogo pesquisável de artigos de ajuda. O toque abre o texto em modal. Há um catálogo voltado à vida da pessoa e outro voltado às telas da engrenagem.</w:t>
       </w:r>
     </w:p>
     <w:p>
@@ -1165,21 +1244,21 @@
           <w:sz w:val="24"/>
           <w:szCs w:val="24"/>
         </w:rPr>
-        <w:t xml:space="preserve">Cuidado pastoral (pedido de oração)</w:t>
-      </w:r>
-    </w:p>
-    <w:p>
-      <w:pPr>
-        <w:spacing w:after="160" w:line="276"/>
-      </w:pPr>
-      <w:r>
-        <w:rPr>
-          <w:rFonts w:ascii="Calibri" w:cs="Calibri" w:eastAsia="Calibri" w:hAnsi="Calibri"/>
-          <w:color w:val="334155"/>
-          <w:sz w:val="22"/>
-          <w:szCs w:val="22"/>
-        </w:rPr>
-        <w:t xml:space="preserve">Formulário para compartilhar um pedido com a equipe. Uma tela à parte mostra o histórico de atendimentos quando a pessoa já passou por horários de cuidado.</w:t>
+        <w:t xml:space="preserve">Redes sociais e Sobre o Conecta+</w:t>
+      </w:r>
+    </w:p>
+    <w:p>
+      <w:pPr>
+        <w:spacing w:after="160" w:line="276"/>
+      </w:pPr>
+      <w:r>
+        <w:rPr>
+          <w:rFonts w:ascii="Calibri" w:cs="Calibri" w:eastAsia="Calibri" w:hAnsi="Calibri"/>
+          <w:color w:val="334155"/>
+          <w:sz w:val="22"/>
+          <w:szCs w:val="22"/>
+        </w:rPr>
+        <w:t xml:space="preserve">Links e presença da igreja nas redes, e uma tela institucional sobre o produto.</w:t>
       </w:r>
     </w:p>
     <w:p>
@@ -1196,21 +1275,21 @@
           <w:sz w:val="24"/>
           <w:szCs w:val="24"/>
         </w:rPr>
-        <w:t xml:space="preserve">Trilha de discipulado</w:t>
-      </w:r>
-    </w:p>
-    <w:p>
-      <w:pPr>
-        <w:spacing w:after="160" w:line="276"/>
-      </w:pPr>
-      <w:r>
-        <w:rPr>
-          <w:rFonts w:ascii="Calibri" w:cs="Calibri" w:eastAsia="Calibri" w:hAnsi="Calibri"/>
-          <w:color w:val="334155"/>
-          <w:sz w:val="22"/>
-          <w:szCs w:val="22"/>
-        </w:rPr>
-        <w:t xml:space="preserve">Passos com textos, vídeos e reflexões. A pessoa avança no próprio ritmo e vê o progresso.</w:t>
+        <w:t xml:space="preserve">Cuidado pastoral (pedido de oração)</w:t>
+      </w:r>
+    </w:p>
+    <w:p>
+      <w:pPr>
+        <w:spacing w:after="160" w:line="276"/>
+      </w:pPr>
+      <w:r>
+        <w:rPr>
+          <w:rFonts w:ascii="Calibri" w:cs="Calibri" w:eastAsia="Calibri" w:hAnsi="Calibri"/>
+          <w:color w:val="334155"/>
+          <w:sz w:val="22"/>
+          <w:szCs w:val="22"/>
+        </w:rPr>
+        <w:t xml:space="preserve">Formulário para compartilhar um pedido com a equipe. Uma tela à parte mostra o histórico e, quando o pedido já está em acompanhamento, exibe um banner para solicitar cancelamento com justificativa. A confirmação e o botão Excluir ficam reservados ao Super Administrador.</w:t>
       </w:r>
     </w:p>
     <w:p>
@@ -1227,21 +1306,21 @@
           <w:sz w:val="24"/>
           <w:szCs w:val="24"/>
         </w:rPr>
-        <w:t xml:space="preserve">Relatório de despesas (RD)</w:t>
-      </w:r>
-    </w:p>
-    <w:p>
-      <w:pPr>
-        <w:spacing w:after="160" w:line="276"/>
-      </w:pPr>
-      <w:r>
-        <w:rPr>
-          <w:rFonts w:ascii="Calibri" w:cs="Calibri" w:eastAsia="Calibri" w:hAnsi="Calibri"/>
-          <w:color w:val="334155"/>
-          <w:sz w:val="22"/>
-          <w:szCs w:val="22"/>
-        </w:rPr>
-        <w:t xml:space="preserve">Lançar e acompanhar prestações de contas pessoais ligadas à igreja, com formulário e listagem.</w:t>
+        <w:t xml:space="preserve">Trilha de discipulado</w:t>
+      </w:r>
+    </w:p>
+    <w:p>
+      <w:pPr>
+        <w:spacing w:after="160" w:line="276"/>
+      </w:pPr>
+      <w:r>
+        <w:rPr>
+          <w:rFonts w:ascii="Calibri" w:cs="Calibri" w:eastAsia="Calibri" w:hAnsi="Calibri"/>
+          <w:color w:val="334155"/>
+          <w:sz w:val="22"/>
+          <w:szCs w:val="22"/>
+        </w:rPr>
+        <w:t xml:space="preserve">Passos com textos, vídeos e reflexões. A pessoa avança no próprio ritmo e vê o progresso.</w:t>
       </w:r>
     </w:p>
     <w:p>
@@ -1258,21 +1337,21 @@
           <w:sz w:val="24"/>
           <w:szCs w:val="24"/>
         </w:rPr>
-        <w:t xml:space="preserve">Aniversariantes, lista de membros, mapa e administrativo</w:t>
-      </w:r>
-    </w:p>
-    <w:p>
-      <w:pPr>
-        <w:spacing w:after="160" w:line="276"/>
-      </w:pPr>
-      <w:r>
-        <w:rPr>
-          <w:rFonts w:ascii="Calibri" w:cs="Calibri" w:eastAsia="Calibri" w:hAnsi="Calibri"/>
-          <w:color w:val="334155"/>
-          <w:sz w:val="22"/>
-          <w:szCs w:val="22"/>
-        </w:rPr>
-        <w:t xml:space="preserve">Diretório da comunidade, lista de aniversariantes, mapa com pins das famílias e área de atos constitutivos ou documentos administrativos da igreja — sempre como telas de consulta e, quando o fluxo permite, de edição pontual.</w:t>
+        <w:t xml:space="preserve">Relatório de despesas (RD)</w:t>
+      </w:r>
+    </w:p>
+    <w:p>
+      <w:pPr>
+        <w:spacing w:after="160" w:line="276"/>
+      </w:pPr>
+      <w:r>
+        <w:rPr>
+          <w:rFonts w:ascii="Calibri" w:cs="Calibri" w:eastAsia="Calibri" w:hAnsi="Calibri"/>
+          <w:color w:val="334155"/>
+          <w:sz w:val="22"/>
+          <w:szCs w:val="22"/>
+        </w:rPr>
+        <w:t xml:space="preserve">Lançar e acompanhar prestações de contas pessoais ligadas à igreja, com formulário e listagem.</w:t>
       </w:r>
     </w:p>
     <w:p>
@@ -1289,21 +1368,21 @@
           <w:sz w:val="24"/>
           <w:szCs w:val="24"/>
         </w:rPr>
-        <w:t xml:space="preserve">Livros doados</w:t>
-      </w:r>
-    </w:p>
-    <w:p>
-      <w:pPr>
-        <w:spacing w:after="160" w:line="276"/>
-      </w:pPr>
-      <w:r>
-        <w:rPr>
-          <w:rFonts w:ascii="Calibri" w:cs="Calibri" w:eastAsia="Calibri" w:hAnsi="Calibri"/>
-          <w:color w:val="334155"/>
-          <w:sz w:val="22"/>
-          <w:szCs w:val="22"/>
-        </w:rPr>
-        <w:t xml:space="preserve">Acervo com busca (inclusive por ISBN), cadastro manual de títulos e avisos de empréstimo no inbox.</w:t>
+        <w:t xml:space="preserve">Aniversariantes, lista de membros, mapa e documentos</w:t>
+      </w:r>
+    </w:p>
+    <w:p>
+      <w:pPr>
+        <w:spacing w:after="160" w:line="276"/>
+      </w:pPr>
+      <w:r>
+        <w:rPr>
+          <w:rFonts w:ascii="Calibri" w:cs="Calibri" w:eastAsia="Calibri" w:hAnsi="Calibri"/>
+          <w:color w:val="334155"/>
+          <w:sz w:val="22"/>
+          <w:szCs w:val="22"/>
+        </w:rPr>
+        <w:t xml:space="preserve">Diretório da comunidade, lista de aniversariantes, mapa com pins das famílias e Documentos oficiais da igreja — atas de assembleia e outros arquivos publicados — sempre como telas de consulta e, quando o fluxo permite, de edição pontual.</w:t>
       </w:r>
     </w:p>
     <w:p>
@@ -1320,6 +1399,37 @@
           <w:sz w:val="24"/>
           <w:szCs w:val="24"/>
         </w:rPr>
+        <w:t xml:space="preserve">Livros doados</w:t>
+      </w:r>
+    </w:p>
+    <w:p>
+      <w:pPr>
+        <w:spacing w:after="160" w:line="276"/>
+      </w:pPr>
+      <w:r>
+        <w:rPr>
+          <w:rFonts w:ascii="Calibri" w:cs="Calibri" w:eastAsia="Calibri" w:hAnsi="Calibri"/>
+          <w:color w:val="334155"/>
+          <w:sz w:val="22"/>
+          <w:szCs w:val="22"/>
+        </w:rPr>
+        <w:t xml:space="preserve">Acervo com busca (inclusive por ISBN), cadastro manual de títulos e avisos de empréstimo no inbox.</w:t>
+      </w:r>
+    </w:p>
+    <w:p>
+      <w:pPr>
+        <w:pStyle w:val="Heading3"/>
+        <w:spacing w:after="80" w:before="200"/>
+      </w:pPr>
+      <w:r>
+        <w:rPr>
+          <w:rFonts w:ascii="Calibri" w:cs="Calibri" w:eastAsia="Calibri" w:hAnsi="Calibri"/>
+          <w:b/>
+          <w:bCs/>
+          <w:color w:val="0F172A"/>
+          <w:sz w:val="24"/>
+          <w:szCs w:val="24"/>
+        </w:rPr>
         <w:t xml:space="preserve">Avisos e orquestração de comunicados</w:t>
       </w:r>
     </w:p>
@@ -1530,6 +1640,44 @@
           <w:sz w:val="22"/>
           <w:szCs w:val="22"/>
         </w:rPr>
+        <w:t xml:space="preserve">Lista de Famílias: diretório por núcleo familiar, com busca e consulta dos integrantes autorizados.</w:t>
+      </w:r>
+    </w:p>
+    <w:p>
+      <w:pPr>
+        <w:pStyle w:val="ListParagraph"/>
+        <w:numPr>
+          <w:ilvl w:val="0"/>
+          <w:numId w:val="2"/>
+        </w:numPr>
+        <w:spacing w:after="80" w:line="276"/>
+      </w:pPr>
+      <w:r>
+        <w:rPr>
+          <w:rFonts w:ascii="Calibri" w:cs="Calibri" w:eastAsia="Calibri" w:hAnsi="Calibri"/>
+          <w:color w:val="334155"/>
+          <w:sz w:val="22"/>
+          <w:szCs w:val="22"/>
+        </w:rPr>
+        <w:t xml:space="preserve">Visitantes — Cadastro Rápido: registra o visitante, gera o crachá/QR e prepara o compartilhamento pelo WhatsApp.</w:t>
+      </w:r>
+    </w:p>
+    <w:p>
+      <w:pPr>
+        <w:pStyle w:val="ListParagraph"/>
+        <w:numPr>
+          <w:ilvl w:val="0"/>
+          <w:numId w:val="2"/>
+        </w:numPr>
+        <w:spacing w:after="80" w:line="276"/>
+      </w:pPr>
+      <w:r>
+        <w:rPr>
+          <w:rFonts w:ascii="Calibri" w:cs="Calibri" w:eastAsia="Calibri" w:hAnsi="Calibri"/>
+          <w:color w:val="334155"/>
+          <w:sz w:val="22"/>
+          <w:szCs w:val="22"/>
+        </w:rPr>
         <w:t xml:space="preserve">Mapa de geolocalização: mapa interativo com pins das famílias.</w:t>
       </w:r>
     </w:p>
@@ -1832,6 +1980,25 @@
           <w:sz w:val="22"/>
           <w:szCs w:val="22"/>
         </w:rPr>
+        <w:t xml:space="preserve">Espaço Infantil: na Agenda da Família, o responsável apresenta o QR para check-in e check-out; na Sala, a equipe lê o mesmo código para registrar entrega e retirada segura.</w:t>
+      </w:r>
+    </w:p>
+    <w:p>
+      <w:pPr>
+        <w:pStyle w:val="ListParagraph"/>
+        <w:numPr>
+          <w:ilvl w:val="0"/>
+          <w:numId w:val="2"/>
+        </w:numPr>
+        <w:spacing w:after="80" w:line="276"/>
+      </w:pPr>
+      <w:r>
+        <w:rPr>
+          <w:rFonts w:ascii="Calibri" w:cs="Calibri" w:eastAsia="Calibri" w:hAnsi="Calibri"/>
+          <w:color w:val="334155"/>
+          <w:sz w:val="22"/>
+          <w:szCs w:val="22"/>
+        </w:rPr>
         <w:t xml:space="preserve">Tipos de escala: cadastro dos tipos de serviço.</w:t>
       </w:r>
     </w:p>
@@ -2094,7 +2261,7 @@
           <w:sz w:val="22"/>
           <w:szCs w:val="22"/>
         </w:rPr>
-        <w:t xml:space="preserve">Mudança de papéis: busca da pessoa e alteração do papel, com lista filtrada no topo (Enxergar).</w:t>
+        <w:t xml:space="preserve">Mudança de papéis: busca da pessoa e alteração do vínculo, com lista filtrada no topo (Enxergar). Atribuições aparece ao lado e liga ou desliga papéis operacionais sem substituir a jornada de vínculo.</w:t>
       </w:r>
     </w:p>
     <w:p>
@@ -2132,26 +2299,26 @@
           <w:sz w:val="22"/>
           <w:szCs w:val="22"/>
         </w:rPr>
-        <w:t xml:space="preserve">Acesso usuários: visão de quem entrou e como usa o sistema.</w:t>
-      </w:r>
-    </w:p>
-    <w:p>
-      <w:pPr>
-        <w:pStyle w:val="ListParagraph"/>
-        <w:numPr>
-          <w:ilvl w:val="0"/>
-          <w:numId w:val="2"/>
-        </w:numPr>
-        <w:spacing w:after="80" w:line="276"/>
-      </w:pPr>
-      <w:r>
-        <w:rPr>
-          <w:rFonts w:ascii="Calibri" w:cs="Calibri" w:eastAsia="Calibri" w:hAnsi="Calibri"/>
-          <w:color w:val="334155"/>
-          <w:sz w:val="22"/>
-          <w:szCs w:val="22"/>
-        </w:rPr>
-        <w:t xml:space="preserve">Modo Ghost: ver a aplicação com os olhos de outra pessoa, sem sair da sessão atual.</w:t>
+        <w:t xml:space="preserve">Acesso usuários: visão de quem entrou e como usa o sistema, exclusiva do Super Administrador.</w:t>
+      </w:r>
+    </w:p>
+    <w:p>
+      <w:pPr>
+        <w:pStyle w:val="ListParagraph"/>
+        <w:numPr>
+          <w:ilvl w:val="0"/>
+          <w:numId w:val="2"/>
+        </w:numPr>
+        <w:spacing w:after="80" w:line="276"/>
+      </w:pPr>
+      <w:r>
+        <w:rPr>
+          <w:rFonts w:ascii="Calibri" w:cs="Calibri" w:eastAsia="Calibri" w:hAnsi="Calibri"/>
+          <w:color w:val="334155"/>
+          <w:sz w:val="22"/>
+          <w:szCs w:val="22"/>
+        </w:rPr>
+        <w:t xml:space="preserve">Modo Ghost: ver a aplicação com a identidade efetiva de outra pessoa, sem sair da sessão atual. O auditor permanece na rota escolhida, sem retorno forçado ao Início e sem ser enviado à cobrança por causa do perfil-alvo.</w:t>
       </w:r>
     </w:p>
     <w:p>
@@ -2244,6 +2411,37 @@
           <w:sz w:val="26"/>
           <w:szCs w:val="26"/>
         </w:rPr>
+        <w:t xml:space="preserve">Gestão comercial e bloqueios</w:t>
+      </w:r>
+    </w:p>
+    <w:p>
+      <w:pPr>
+        <w:spacing w:after="160" w:line="276"/>
+      </w:pPr>
+      <w:r>
+        <w:rPr>
+          <w:rFonts w:ascii="Calibri" w:cs="Calibri" w:eastAsia="Calibri" w:hAnsi="Calibri"/>
+          <w:color w:val="334155"/>
+          <w:sz w:val="22"/>
+          <w:szCs w:val="22"/>
+        </w:rPr>
+        <w:t xml:space="preserve">Gestão Liberada desliga o paywall comercial para toda a instância, mas não concede permissões de tela. Assinaturas reúne planos, contratos, Stripe, renovação e cancelamento. Com a gestão bloqueada e sem condição comercial válida, a engrenagem respeita o bloqueio; o Super Administrador continua apto a administrar a cobrança. No Ghost, assinatura, tenant e paywall são avaliados pela identidade real do auditor, nunca pelo alvo.</w:t>
+      </w:r>
+    </w:p>
+    <w:p>
+      <w:pPr>
+        <w:pStyle w:val="Heading2"/>
+        <w:spacing w:after="120" w:before="280"/>
+      </w:pPr>
+      <w:r>
+        <w:rPr>
+          <w:rFonts w:ascii="Calibri" w:cs="Calibri" w:eastAsia="Calibri" w:hAnsi="Calibri"/>
+          <w:b/>
+          <w:bCs/>
+          <w:color w:val="1B4F8A"/>
+          <w:sz w:val="26"/>
+          <w:szCs w:val="26"/>
+        </w:rPr>
         <w:t xml:space="preserve">Painel de manutenção</w:t>
       </w:r>
     </w:p>
@@ -2832,7 +3030,7 @@
           <w:sz w:val="22"/>
           <w:szCs w:val="22"/>
         </w:rPr>
-        <w:t xml:space="preserve">Barra Encerrar sessão no menu, ou simplesmente Fechar até o Início. Sessão expirada leva à tela de sessão encerrada e de novo ao login.</w:t>
+        <w:t xml:space="preserve">Barra Encerrar sessão no menu, ou simplesmente Fechar até o Início. Sessão expirada leva à tela de sessão encerrada e de novo ao login. Cada instância pode ligar a opção Ao sair e informar uma URL oficial; nesse caso, somente depois de limpar a sessão o app abre o site configurado. Com o switch desligado, o logout apenas volta ao login.</w:t>
       </w:r>
     </w:p>
     <w:p>

</xml_diff>